<commit_message>
Add Figma, GitHub, and Vercel links to the Word report.
Include the three project URLs on the cover, in the deployment section, conclusion, checklist, and references.

Co-authored-by: Biidayy <huy.2374802010778@vanlanguni.vn>
</commit_message>
<xml_diff>
--- a/docs/bao-cao/BAO_CAO_DO_AN_TKGD_CGV.docx
+++ b/docs/bao-cao/BAO_CAO_DO_AN_TKGD_CGV.docx
@@ -184,6 +184,111 @@
     <w:p/>
     <w:p/>
     <w:p/>
+    <w:p>
+      <w:pPr>
+        <w:spacing w:line="360" w:lineRule="auto"/>
+        <w:jc w:val="center"/>
+      </w:pPr>
+    </w:p>
+    <w:p>
+      <w:pPr>
+        <w:spacing w:line="360" w:lineRule="auto"/>
+        <w:jc w:val="center"/>
+      </w:pPr>
+      <w:r>
+        <w:rPr>
+          <w:rFonts w:ascii="Times New Roman" w:hAnsi="Times New Roman" w:eastAsia="Times New Roman"/>
+          <w:b/>
+          <w:i w:val="0"/>
+          <w:sz w:val="26"/>
+        </w:rPr>
+        <w:t>Liên kết đồ án</w:t>
+      </w:r>
+    </w:p>
+    <w:p>
+      <w:pPr>
+        <w:spacing w:line="360" w:lineRule="auto"/>
+        <w:jc w:val="center"/>
+      </w:pPr>
+      <w:r>
+        <w:rPr>
+          <w:rFonts w:ascii="Times New Roman" w:hAnsi="Times New Roman" w:eastAsia="Times New Roman"/>
+          <w:b/>
+          <w:i w:val="0"/>
+          <w:sz w:val="24"/>
+        </w:rPr>
+        <w:t xml:space="preserve">Figma: </w:t>
+      </w:r>
+      <w:hyperlink r:id="rId16">
+        <w:r>
+          <w:rPr>
+            <w:color w:val="0563C1"/>
+            <w:u w:val="single"/>
+            <w:sz w:val="22"/>
+            <w:rFonts w:ascii="Times New Roman" w:hAnsi="Times New Roman" w:eastAsia="Times New Roman"/>
+          </w:rPr>
+          <w:t xml:space="preserve">https://www.figma.com/design/flehtpWOpHLT2BFGYpdA4Q/GiaoDienNguoiDung?t=gEkStoAa1Dw2BtoY-1</w:t>
+        </w:r>
+      </w:hyperlink>
+    </w:p>
+    <w:p>
+      <w:pPr>
+        <w:spacing w:line="360" w:lineRule="auto"/>
+        <w:jc w:val="center"/>
+      </w:pPr>
+      <w:r>
+        <w:rPr>
+          <w:rFonts w:ascii="Times New Roman" w:hAnsi="Times New Roman" w:eastAsia="Times New Roman"/>
+          <w:b/>
+          <w:i w:val="0"/>
+          <w:sz w:val="24"/>
+        </w:rPr>
+        <w:t xml:space="preserve">GitHub: </w:t>
+      </w:r>
+      <w:hyperlink r:id="rId15">
+        <w:r>
+          <w:rPr>
+            <w:color w:val="0563C1"/>
+            <w:u w:val="single"/>
+            <w:sz w:val="22"/>
+            <w:rFonts w:ascii="Times New Roman" w:hAnsi="Times New Roman" w:eastAsia="Times New Roman"/>
+          </w:rPr>
+          <w:t xml:space="preserve">https://github.com/Biidayy/CGV_WebsiteFE</w:t>
+        </w:r>
+      </w:hyperlink>
+    </w:p>
+    <w:p>
+      <w:pPr>
+        <w:spacing w:line="360" w:lineRule="auto"/>
+        <w:jc w:val="center"/>
+      </w:pPr>
+      <w:r>
+        <w:rPr>
+          <w:rFonts w:ascii="Times New Roman" w:hAnsi="Times New Roman" w:eastAsia="Times New Roman"/>
+          <w:b/>
+          <w:i w:val="0"/>
+          <w:sz w:val="24"/>
+        </w:rPr>
+        <w:t xml:space="preserve">Vercel: </w:t>
+      </w:r>
+      <w:hyperlink r:id="rId14">
+        <w:r>
+          <w:rPr>
+            <w:color w:val="0563C1"/>
+            <w:u w:val="single"/>
+            <w:sz w:val="22"/>
+            <w:rFonts w:ascii="Times New Roman" w:hAnsi="Times New Roman" w:eastAsia="Times New Roman"/>
+          </w:rPr>
+          <w:t xml:space="preserve">https://cgv-website-fe.vercel.app/cgv/</w:t>
+        </w:r>
+      </w:hyperlink>
+    </w:p>
+    <w:p>
+      <w:pPr>
+        <w:spacing w:line="360" w:lineRule="auto"/>
+        <w:jc w:val="center"/>
+      </w:pPr>
+    </w:p>
     <w:p>
       <w:pPr>
         <w:jc w:val="center"/>
@@ -2553,7 +2658,28 @@
           <w:i w:val="0"/>
           <w:sz w:val="26"/>
         </w:rPr>
-        <w:t>Trước khi code, nhóm thiết kế các khung hình chính trên Figma để thống nhất bố cục, khoảng cách và thứ tự thông tin. Sáu trang trọng tâm gồm:</w:t>
+        <w:t xml:space="preserve">Trước khi code, nhóm thiết kế các khung hình chính trên Figma để thống nhất bố cục, khoảng cách và thứ tự thông tin. File thiết kế: </w:t>
+      </w:r>
+      <w:hyperlink r:id="rId16">
+        <w:r>
+          <w:rPr>
+            <w:color w:val="0563C1"/>
+            <w:u w:val="single"/>
+            <w:sz w:val="24"/>
+            <w:szCs w:val="24"/>
+            <w:rFonts w:ascii="Times New Roman" w:hAnsi="Times New Roman" w:eastAsia="Times New Roman"/>
+          </w:rPr>
+          <w:t xml:space="preserve">https://www.figma.com/design/flehtpWOpHLT2BFGYpdA4Q/GiaoDienNguoiDung?t=gEkStoAa1Dw2BtoY-1</w:t>
+        </w:r>
+      </w:hyperlink>
+      <w:r>
+        <w:rPr>
+          <w:rFonts w:ascii="Times New Roman" w:hAnsi="Times New Roman" w:eastAsia="Times New Roman"/>
+          <w:b w:val="0"/>
+          <w:i w:val="0"/>
+          <w:sz w:val="26"/>
+        </w:rPr>
+        <w:t>. Sáu trang trọng tâm gồm:</w:t>
       </w:r>
     </w:p>
     <w:tbl>
@@ -6171,7 +6297,49 @@
           <w:i w:val="0"/>
           <w:sz w:val="26"/>
         </w:rPr>
-        <w:t>Mã nguồn được đẩy lên GitHub (repository public) và tự động deploy GitHub Pages qua workflow .github/workflows/deploy-pages.yml khi có push lên nhánh main hoặc huy. Ngoài ra dự án có vercel.json để rewrite đường dẫn gốc và /cgv khi triển khai trên Vercel. File CNAME hỗ trợ gắn domain tùy chọn.</w:t>
+        <w:t xml:space="preserve">Mã nguồn được đẩy lên GitHub (repository public) tại </w:t>
+      </w:r>
+      <w:hyperlink r:id="rId15">
+        <w:r>
+          <w:rPr>
+            <w:color w:val="0563C1"/>
+            <w:u w:val="single"/>
+            <w:sz w:val="24"/>
+            <w:szCs w:val="24"/>
+            <w:rFonts w:ascii="Times New Roman" w:hAnsi="Times New Roman" w:eastAsia="Times New Roman"/>
+          </w:rPr>
+          <w:t xml:space="preserve">https://github.com/Biidayy/CGV_WebsiteFE</w:t>
+        </w:r>
+      </w:hyperlink>
+      <w:r>
+        <w:rPr>
+          <w:rFonts w:ascii="Times New Roman" w:hAnsi="Times New Roman" w:eastAsia="Times New Roman"/>
+          <w:b w:val="0"/>
+          <w:i w:val="0"/>
+          <w:sz w:val="26"/>
+        </w:rPr>
+        <w:t xml:space="preserve"> và tự động deploy GitHub Pages qua workflow .github/workflows/deploy-pages.yml khi có push lên nhánh main hoặc huy. Đồng thời dự án được triển khai trên Vercel với đường dẫn chính thức: </w:t>
+      </w:r>
+      <w:hyperlink r:id="rId14">
+        <w:r>
+          <w:rPr>
+            <w:color w:val="0563C1"/>
+            <w:u w:val="single"/>
+            <w:sz w:val="24"/>
+            <w:szCs w:val="24"/>
+            <w:rFonts w:ascii="Times New Roman" w:hAnsi="Times New Roman" w:eastAsia="Times New Roman"/>
+          </w:rPr>
+          <w:t xml:space="preserve">https://cgv-website-fe.vercel.app/cgv/</w:t>
+        </w:r>
+      </w:hyperlink>
+      <w:r>
+        <w:rPr>
+          <w:rFonts w:ascii="Times New Roman" w:hAnsi="Times New Roman" w:eastAsia="Times New Roman"/>
+          <w:b w:val="0"/>
+          <w:i w:val="0"/>
+          <w:sz w:val="26"/>
+        </w:rPr>
+        <w:t>. File vercel.json hỗ trợ rewrite đường dẫn gốc và /cgv; file CNAME hỗ trợ gắn domain tùy chọn.</w:t>
       </w:r>
     </w:p>
     <w:tbl>
@@ -6328,7 +6496,6 @@
             <w:tcW w:type="dxa" w:w="6236"/>
           </w:tcPr>
           <w:p>
-            <w:r/>
             <w:r>
               <w:rPr>
                 <w:rFonts w:ascii="Times New Roman" w:hAnsi="Times New Roman" w:eastAsia="Times New Roman"/>
@@ -6379,6 +6546,84 @@
           </w:p>
         </w:tc>
       </w:tr>
+      <w:tr>
+        <w:tc>
+          <w:tcPr>
+            <w:tcW w:type="dxa" w:w="4535"/>
+          </w:tcPr>
+          <w:p>
+            <w:r/>
+            <w:r>
+              <w:rPr>
+                <w:rFonts w:ascii="Times New Roman" w:hAnsi="Times New Roman" w:eastAsia="Times New Roman"/>
+                <w:b w:val="0"/>
+                <w:i w:val="0"/>
+                <w:sz w:val="22"/>
+              </w:rPr>
+              <w:t>Website Vercel</w:t>
+            </w:r>
+          </w:p>
+        </w:tc>
+        <w:tc>
+          <w:tcPr>
+            <w:tcW w:type="dxa" w:w="4535"/>
+          </w:tcPr>
+          <w:p>
+            <w:r/>
+            <w:hyperlink r:id="rId14">
+              <w:r>
+                <w:rPr>
+                  <w:color w:val="0563C1"/>
+                  <w:u w:val="single"/>
+                  <w:sz w:val="22"/>
+                  <w:szCs w:val="22"/>
+                  <w:rFonts w:ascii="Times New Roman" w:hAnsi="Times New Roman" w:eastAsia="Times New Roman"/>
+                </w:rPr>
+                <w:t xml:space="preserve">https://cgv-website-fe.vercel.app/cgv/</w:t>
+              </w:r>
+            </w:hyperlink>
+          </w:p>
+        </w:tc>
+      </w:tr>
+      <w:tr>
+        <w:tc>
+          <w:tcPr>
+            <w:tcW w:type="dxa" w:w="4535"/>
+          </w:tcPr>
+          <w:p>
+            <w:r/>
+            <w:r>
+              <w:rPr>
+                <w:rFonts w:ascii="Times New Roman" w:hAnsi="Times New Roman" w:eastAsia="Times New Roman"/>
+                <w:b w:val="0"/>
+                <w:i w:val="0"/>
+                <w:sz w:val="22"/>
+              </w:rPr>
+              <w:t>Thiết kế Figma</w:t>
+            </w:r>
+          </w:p>
+        </w:tc>
+        <w:tc>
+          <w:tcPr>
+            <w:tcW w:type="dxa" w:w="4535"/>
+          </w:tcPr>
+          <w:p>
+            <w:r/>
+            <w:hyperlink r:id="rId16">
+              <w:r>
+                <w:rPr>
+                  <w:color w:val="0563C1"/>
+                  <w:u w:val="single"/>
+                  <w:sz w:val="22"/>
+                  <w:szCs w:val="22"/>
+                  <w:rFonts w:ascii="Times New Roman" w:hAnsi="Times New Roman" w:eastAsia="Times New Roman"/>
+                </w:rPr>
+                <w:t xml:space="preserve">https://www.figma.com/design/flehtpWOpHLT2BFGYpdA4Q/GiaoDienNguoiDung?t=gEkStoAa1Dw2BtoY-1</w:t>
+              </w:r>
+            </w:hyperlink>
+          </w:p>
+        </w:tc>
+      </w:tr>
     </w:tbl>
     <w:p/>
     <w:p>
@@ -6394,6 +6639,43 @@
           <w:sz w:val="22"/>
         </w:rPr>
         <w:t>Bảng 6.1. Liên kết phục vụ chấm bài / demo</w:t>
+      </w:r>
+    </w:p>
+    <w:p>
+      <w:pPr>
+        <w:spacing w:line="360" w:lineRule="auto"/>
+        <w:ind w:firstLine="567"/>
+        <w:jc w:val="both"/>
+      </w:pPr>
+      <w:r>
+        <w:rPr>
+          <w:rFonts w:ascii="Times New Roman" w:hAnsi="Times New Roman" w:eastAsia="Times New Roman"/>
+          <w:b w:val="0"/>
+          <w:i w:val="0"/>
+          <w:sz w:val="26"/>
+        </w:rPr>
+        <w:t xml:space="preserve">Ba liên kết chính dùng khi báo cáo / demo: thiết kế Figma, mã nguồn GitHub và website chạy trên Vercel. Khuyến nghị mở demo trực tiếp tại </w:t>
+      </w:r>
+      <w:hyperlink r:id="rId14">
+        <w:r>
+          <w:rPr>
+            <w:color w:val="0563C1"/>
+            <w:u w:val="single"/>
+            <w:sz w:val="24"/>
+            <w:szCs w:val="24"/>
+            <w:rFonts w:ascii="Times New Roman" w:hAnsi="Times New Roman" w:eastAsia="Times New Roman"/>
+          </w:rPr>
+          <w:t xml:space="preserve">https://cgv-website-fe.vercel.app/cgv/</w:t>
+        </w:r>
+      </w:hyperlink>
+      <w:r>
+        <w:rPr>
+          <w:rFonts w:ascii="Times New Roman" w:hAnsi="Times New Roman" w:eastAsia="Times New Roman"/>
+          <w:b w:val="0"/>
+          <w:i w:val="0"/>
+          <w:sz w:val="26"/>
+        </w:rPr>
+        <w:t>.</w:t>
       </w:r>
     </w:p>
     <w:p>
@@ -8026,7 +8308,28 @@
           <w:i w:val="0"/>
           <w:sz w:val="26"/>
         </w:rPr>
-        <w:t>Sản phẩm đã được triển khai công khai trên GitHub Pages (và cấu hình sẵn cho Vercel), kèm tài liệu hướng dẫn sử dụng. Trong khuôn khổ môn Thiết kế Giao diện Người dùng, đồ án đáp ứng yêu cầu về thiết kế UI/UX, hiện thực giao diện và minh họa luồng nghiệp vụ đặt vé ở mức mô phỏng. Các hướng phát triển tiếp theo tập trung vào backend, xác thực và thanh toán thật nhằm tiến gần hơn tới hệ thống đặt vé hoàn chỉnh.</w:t>
+        <w:t xml:space="preserve">Sản phẩm đã được triển khai công khai trên GitHub Pages và Vercel (đường dẫn demo: </w:t>
+      </w:r>
+      <w:hyperlink r:id="rId14">
+        <w:r>
+          <w:rPr>
+            <w:color w:val="0563C1"/>
+            <w:u w:val="single"/>
+            <w:sz w:val="24"/>
+            <w:szCs w:val="24"/>
+            <w:rFonts w:ascii="Times New Roman" w:hAnsi="Times New Roman" w:eastAsia="Times New Roman"/>
+          </w:rPr>
+          <w:t xml:space="preserve">https://cgv-website-fe.vercel.app/cgv/</w:t>
+        </w:r>
+      </w:hyperlink>
+      <w:r>
+        <w:rPr>
+          <w:rFonts w:ascii="Times New Roman" w:hAnsi="Times New Roman" w:eastAsia="Times New Roman"/>
+          <w:b w:val="0"/>
+          <w:i w:val="0"/>
+          <w:sz w:val="26"/>
+        </w:rPr>
+        <w:t>), kèm tài liệu hướng dẫn sử dụng và file thiết kế Figma. Trong khuôn khổ môn Thiết kế Giao diện Người dùng, đồ án đáp ứng yêu cầu về thiết kế UI/UX, hiện thực giao diện và minh họa luồng nghiệp vụ đặt vé ở mức mô phỏng. Các hướng phát triển tiếp theo tập trung vào backend, xác thực và thanh toán thật nhằm tiến gần hơn tới hệ thống đặt vé hoàn chỉnh.</w:t>
       </w:r>
     </w:p>
     <w:p>
@@ -8116,13 +8419,20 @@
           <w:i w:val="0"/>
           <w:sz w:val="24"/>
         </w:rPr>
-        <w:t>[4] GitHub Pages Documentation: https://docs.github.com/pages</w:t>
+        <w:t xml:space="preserve">[4] GitHub repository đồ án: </w:t>
       </w:r>
-    </w:p>
-    <w:p>
-      <w:pPr>
-        <w:ind w:left="425" w:hanging="425"/>
-      </w:pPr>
+      <w:hyperlink r:id="rId15">
+        <w:r>
+          <w:rPr>
+            <w:color w:val="0563C1"/>
+            <w:u w:val="single"/>
+            <w:sz w:val="24"/>
+            <w:szCs w:val="24"/>
+            <w:rFonts w:ascii="Times New Roman" w:hAnsi="Times New Roman" w:eastAsia="Times New Roman"/>
+          </w:rPr>
+          <w:t xml:space="preserve">https://github.com/Biidayy/CGV_WebsiteFE</w:t>
+        </w:r>
+      </w:hyperlink>
       <w:r>
         <w:rPr>
           <w:rFonts w:ascii="Times New Roman" w:hAnsi="Times New Roman" w:eastAsia="Times New Roman"/>
@@ -8130,8 +8440,20 @@
           <w:i w:val="0"/>
           <w:sz w:val="24"/>
         </w:rPr>
-        <w:t>[5] Vercel Documentation: https://vercel.com/docs</w:t>
+        <w:t xml:space="preserve"> — GitHub Pages: </w:t>
       </w:r>
+      <w:hyperlink r:id="rId17">
+        <w:r>
+          <w:rPr>
+            <w:color w:val="0563C1"/>
+            <w:u w:val="single"/>
+            <w:sz w:val="24"/>
+            <w:szCs w:val="24"/>
+            <w:rFonts w:ascii="Times New Roman" w:hAnsi="Times New Roman" w:eastAsia="Times New Roman"/>
+          </w:rPr>
+          <w:t xml:space="preserve">https://biidayy.github.io/CGV_WebsiteFE/</w:t>
+        </w:r>
+      </w:hyperlink>
     </w:p>
     <w:p>
       <w:pPr>
@@ -8144,8 +8466,55 @@
           <w:i w:val="0"/>
           <w:sz w:val="24"/>
         </w:rPr>
-        <w:t>[6] Nhóm 6 — FEATURES.md, USER_GUIDE.md và mã nguồn repository CGV_WebsiteFE.</w:t>
+        <w:t xml:space="preserve">[5] Website deploy Vercel: </w:t>
       </w:r>
+      <w:hyperlink r:id="rId14">
+        <w:r>
+          <w:rPr>
+            <w:color w:val="0563C1"/>
+            <w:u w:val="single"/>
+            <w:sz w:val="24"/>
+            <w:szCs w:val="24"/>
+            <w:rFonts w:ascii="Times New Roman" w:hAnsi="Times New Roman" w:eastAsia="Times New Roman"/>
+          </w:rPr>
+          <w:t xml:space="preserve">https://cgv-website-fe.vercel.app/cgv/</w:t>
+        </w:r>
+      </w:hyperlink>
+      <w:r>
+        <w:rPr>
+          <w:rFonts w:ascii="Times New Roman" w:hAnsi="Times New Roman" w:eastAsia="Times New Roman"/>
+          <w:b w:val="0"/>
+          <w:i w:val="0"/>
+          <w:sz w:val="24"/>
+        </w:rPr>
+        <w:t xml:space="preserve"> — Tài liệu Vercel: https://vercel.com/docs</w:t>
+      </w:r>
+    </w:p>
+    <w:p>
+      <w:pPr>
+        <w:ind w:left="425" w:hanging="425"/>
+      </w:pPr>
+      <w:r>
+        <w:rPr>
+          <w:rFonts w:ascii="Times New Roman" w:hAnsi="Times New Roman" w:eastAsia="Times New Roman"/>
+          <w:b w:val="0"/>
+          <w:i w:val="0"/>
+          <w:sz w:val="24"/>
+        </w:rPr>
+        <w:t xml:space="preserve">[6] Nhóm 6 — FEATURES.md, USER_GUIDE.md và mã nguồn repository: </w:t>
+      </w:r>
+      <w:hyperlink r:id="rId15">
+        <w:r>
+          <w:rPr>
+            <w:color w:val="0563C1"/>
+            <w:u w:val="single"/>
+            <w:sz w:val="24"/>
+            <w:szCs w:val="24"/>
+            <w:rFonts w:ascii="Times New Roman" w:hAnsi="Times New Roman" w:eastAsia="Times New Roman"/>
+          </w:rPr>
+          <w:t xml:space="preserve">https://github.com/Biidayy/CGV_WebsiteFE</w:t>
+        </w:r>
+      </w:hyperlink>
     </w:p>
     <w:p>
       <w:pPr>
@@ -8160,6 +8529,31 @@
         </w:rPr>
         <w:t>[7] Bài giảng môn Thiết kế Giao diện Người dùng — Thầy Nguyễn Hồng Diên.</w:t>
       </w:r>
+    </w:p>
+    <w:p>
+      <w:pPr>
+        <w:ind w:left="425" w:hanging="425"/>
+      </w:pPr>
+      <w:r>
+        <w:rPr>
+          <w:rFonts w:ascii="Times New Roman" w:hAnsi="Times New Roman" w:eastAsia="Times New Roman"/>
+          <w:b w:val="0"/>
+          <w:i w:val="0"/>
+          <w:sz w:val="24"/>
+        </w:rPr>
+        <w:t xml:space="preserve">[8] File thiết kế Figma — GiaoDienNguoiDung: </w:t>
+      </w:r>
+      <w:hyperlink r:id="rId16">
+        <w:r>
+          <w:rPr>
+            <w:color w:val="0563C1"/>
+            <w:u w:val="single"/>
+            <w:sz w:val="24"/>
+            <w:rFonts w:ascii="Times New Roman" w:hAnsi="Times New Roman" w:eastAsia="Times New Roman"/>
+          </w:rPr>
+          <w:t xml:space="preserve">https://www.figma.com/design/flehtpWOpHLT2BFGYpdA4Q/GiaoDienNguoiDung?t=gEkStoAa1Dw2BtoY-1</w:t>
+        </w:r>
+      </w:hyperlink>
     </w:p>
     <w:p>
       <w:r>
@@ -9424,8 +9818,20 @@
           <w:i w:val="0"/>
           <w:sz w:val="26"/>
         </w:rPr>
-        <w:t>☐  Website publish hoạt động: https://biidayy.github.io/CGV_WebsiteFE/</w:t>
+        <w:t xml:space="preserve">☐  Website publish hoạt động (GitHub Pages / Vercel): </w:t>
       </w:r>
+      <w:hyperlink r:id="rId14">
+        <w:r>
+          <w:rPr>
+            <w:color w:val="0563C1"/>
+            <w:u w:val="single"/>
+            <w:sz w:val="24"/>
+            <w:szCs w:val="24"/>
+            <w:rFonts w:ascii="Times New Roman" w:hAnsi="Times New Roman" w:eastAsia="Times New Roman"/>
+          </w:rPr>
+          <w:t xml:space="preserve">https://cgv-website-fe.vercel.app/cgv/</w:t>
+        </w:r>
+      </w:hyperlink>
     </w:p>
     <w:p>
       <w:pPr>

</xml_diff>